<commit_message>
court(washctapp): opening brief gated on docx, passim at six pages (RAP 10.3(a)(2), as the Washington Supreme Court layouts); latex still reported for line fit (fb-595.54.47)
Co-Authored-By: Claude Opus 5.5 <noreply@anthropic.com>
</commit_message>
<xml_diff>
--- a/courts/ninth-circuit/washington/state/court-of-appeals/opening-brief/usage/OUTPUT-opening-brief.docx
+++ b/courts/ninth-circuit/washington/state/court-of-appeals/opening-brief/usage/OUTPUT-opening-brief.docx
@@ -3219,7 +3219,7 @@
           <w:tab w:val="right" w:leader="dot" w:pos="7200"/>
         </w:tabs>
         <w:spacing w:before="224" w:after="0" w:line="322" w:lineRule="exact"/>
-        <w:ind w:left="420" w:right="2380" w:hanging="420"/>
+        <w:ind w:left="420" w:right="2160" w:hanging="420"/>
       </w:pPr>
       <w:r>
         <w:t xml:space="preserve">City</w:t>
@@ -3351,7 +3351,11 @@
         <w:tab/>
       </w:r>
       <w:r>
-        <w:t xml:space="preserve">12, 13, 15, 20, 26, 27</w:t>
+        <w:rPr>
+          <w:i/>
+          <w:iCs/>
+        </w:rPr>
+        <w:t xml:space="preserve">passim</w:t>
       </w:r>
     </w:p>
     <w:p>
@@ -7199,7 +7203,7 @@
           <w:tab w:val="right" w:leader="dot" w:pos="7200"/>
         </w:tabs>
         <w:spacing w:before="224" w:after="0" w:line="322" w:lineRule="exact"/>
-        <w:ind w:left="420" w:right="4620" w:hanging="420"/>
+        <w:ind w:left="420" w:right="2160" w:hanging="420"/>
       </w:pPr>
       <w:r>
         <w:t xml:space="preserve">Article</w:t>
@@ -7229,7 +7233,11 @@
         <w:tab/>
       </w:r>
       <w:r>
-        <w:t xml:space="preserve">1, 3, 11, 12, 13, 15, 20, 24, 25, 26, 27, 39</w:t>
+        <w:rPr>
+          <w:i/>
+          <w:iCs/>
+        </w:rPr>
+        <w:t xml:space="preserve">passim</w:t>
       </w:r>
     </w:p>
     <w:p>

</xml_diff>